<commit_message>
Rubrik «Über uns» mit Team-Platzhaltern
Kennzahlen, Zitat des Inhabers und vier Teamkarten als markierte
Platzhalter, die die Kurt Burri AG ausfüllt. Offerte nennt die Rubrik
und die dafür nötigen Angaben.

Co-Authored-By: Claude Opus 5.5 <noreply@anthropic.com>
Claude-Session: https://claude.ai/code/session_01G2uai6m1fj47jEbDVu8RSR
</commit_message>
<xml_diff>
--- a/offerte/Offerte_2026-001_Kurt-Burri-AG.docx
+++ b/offerte/Offerte_2026-001_Kurt-Burri-AG.docx
@@ -373,7 +373,7 @@
           <w:sz w:val="20"/>
           <w:szCs w:val="20"/>
         </w:rPr>
-        <w:t xml:space="preserve">Kapitel für Sanitär, das neue Bad, Heizung, Boilerentkalkung, Spenglerei, Referenzen und Kontakt</w:t>
+        <w:t xml:space="preserve">Kapitel für Sanitär, das neue Bad, Heizung, Boilerentkalkung, Spenglerei, Referenzen, Über uns mit Team und Kontakt</w:t>
       </w:r>
     </w:p>
     <w:p>
@@ -3895,7 +3895,7 @@
           <w:sz w:val="20"/>
           <w:szCs w:val="20"/>
         </w:rPr>
-        <w:t xml:space="preserve">Angaben zur Firma: Gründungsjahr, Team, Lehrstellen und offene Stellen</w:t>
+        <w:t xml:space="preserve">Angaben zur Firma: Gründungsjahr, Anzahl Mitarbeitende und Lernende, Namen und Funktionen im Team, ein Satz des Inhabers, Lehrstellen und offene Stellen</w:t>
       </w:r>
     </w:p>
     <w:p>

</xml_diff>

<commit_message>
Offerte an neuen Website-Aufbau angepasst
Schnellinfos, Anrufleiste fürs Handy und kürzere Seite beschrieben,
Hinweis auf Beispielangaben und Beispielbilder, Mitwirkung um
Einsatzgebiet und Notfalldienst ergänzt, Datum und Gültigkeit
aktualisiert.

Co-Authored-By: Claude Opus 5.5 <noreply@anthropic.com>
Claude-Session: https://claude.ai/code/session_01G2uai6m1fj47jEbDVu8RSR
</commit_message>
<xml_diff>
--- a/offerte/Offerte_2026-001_Kurt-Burri-AG.docx
+++ b/offerte/Offerte_2026-001_Kurt-Burri-AG.docx
@@ -161,7 +161,7 @@
           <w:sz w:val="20"/>
           <w:szCs w:val="20"/>
         </w:rPr>
-        <w:t xml:space="preserve">, 18. Oktober 2026</w:t>
+        <w:t xml:space="preserve">, 25. Oktober 2026</w:t>
       </w:r>
     </w:p>
     <w:p>
@@ -303,7 +303,7 @@
           <w:sz w:val="20"/>
           <w:szCs w:val="20"/>
         </w:rPr>
-        <w:t xml:space="preserve">Es fehlen Referenzen, ein Firmenprofil, eine E-Mail-Adresse, ein Kontaktformular und Informationen für Stellensuchende.</w:t>
+        <w:t xml:space="preserve">Es fehlen Einsatzgebiet, Notfalldienst, Bürozeiten, E-Mail-Adresse, Referenzen, Firmenprofil, Kontaktformular und Informationen für Stellensuchende.</w:t>
       </w:r>
     </w:p>
     <w:p>
@@ -354,7 +354,7 @@
           <w:sz w:val="20"/>
           <w:szCs w:val="20"/>
         </w:rPr>
-        <w:t xml:space="preserve">Ihre drei Gewerke Sanitär, Heizung und Spenglerei werden in klaren Kapiteln gezeigt, mit grossen Bildern und viel Weissraum. Als Erkennungszeichen läuft eine animierte Kupferleitung durch die Seite und füllt sich beim Scrollen mit Wasser. Die Farben stammen aus Ihrem Logo.</w:t>
+        <w:t xml:space="preserve">Die Website beantwortet zuerst, was Ihre Kunden wissen wollen: Wer sind Sie, kommen Sie zu mir, und wie erreiche ich Sie am schnellsten. Danach folgen Ihre drei Gewerke in kurzen, klaren Kapiteln. Als Erkennungszeichen läuft eine Kupferleitung am Rand mit und füllt sich beim Scrollen mit Wasser. Die Farben stammen aus Ihrem Logo.</w:t>
       </w:r>
     </w:p>
     <w:p>
@@ -373,7 +373,27 @@
           <w:sz w:val="20"/>
           <w:szCs w:val="20"/>
         </w:rPr>
-        <w:t xml:space="preserve">Kapitel für Sanitär, das neue Bad, Heizung, Boilerentkalkung, Spenglerei, Referenzen, Über uns mit Team und Kontakt</w:t>
+        <w:t xml:space="preserve">Gleich oben: </w:t>
+      </w:r>
+      <w:r>
+        <w:rPr>
+          <w:rFonts w:ascii="Arial" w:cs="Arial" w:eastAsia="Arial" w:hAnsi="Arial"/>
+          <w:b/>
+          <w:bCs/>
+          <w:color w:val="1D1D1F"/>
+          <w:sz w:val="20"/>
+          <w:szCs w:val="20"/>
+        </w:rPr>
+        <w:t xml:space="preserve">Ihre Telefonnummer als Hauptknopf</w:t>
+      </w:r>
+      <w:r>
+        <w:rPr>
+          <w:rFonts w:ascii="Arial" w:cs="Arial" w:eastAsia="Arial" w:hAnsi="Arial"/>
+          <w:color w:val="1D1D1F"/>
+          <w:sz w:val="20"/>
+          <w:szCs w:val="20"/>
+        </w:rPr>
+        <w:t xml:space="preserve">, dazu Einsatzgebiet, Notfalldienst, kostenlose Offerte und Bürozeiten</w:t>
       </w:r>
     </w:p>
     <w:p>
@@ -392,27 +412,7 @@
           <w:sz w:val="20"/>
           <w:szCs w:val="20"/>
         </w:rPr>
-        <w:t xml:space="preserve">Neue Rubrik </w:t>
-      </w:r>
-      <w:r>
-        <w:rPr>
-          <w:rFonts w:ascii="Arial" w:cs="Arial" w:eastAsia="Arial" w:hAnsi="Arial"/>
-          <w:b/>
-          <w:bCs/>
-          <w:color w:val="1D1D1F"/>
-          <w:sz w:val="20"/>
-          <w:szCs w:val="20"/>
-        </w:rPr>
-        <w:t xml:space="preserve">«Arbeiten bei uns»</w:t>
-      </w:r>
-      <w:r>
-        <w:rPr>
-          <w:rFonts w:ascii="Arial" w:cs="Arial" w:eastAsia="Arial" w:hAnsi="Arial"/>
-          <w:color w:val="1D1D1F"/>
-          <w:sz w:val="20"/>
-          <w:szCs w:val="20"/>
-        </w:rPr>
-        <w:t xml:space="preserve"> für Lehrstellen, Schnupperlehren und offene Stellen</w:t>
+        <w:t xml:space="preserve">Auf dem Handy eine fixe Leiste, mit der man Sie jederzeit mit einem Tippen anrufen kann</w:t>
       </w:r>
     </w:p>
     <w:p>
@@ -431,7 +431,27 @@
           <w:sz w:val="20"/>
           <w:szCs w:val="20"/>
         </w:rPr>
-        <w:t xml:space="preserve">Kontaktformular mit Themenwahl sowie Direktlinks für Anruf, Online-Termin und Route</w:t>
+        <w:t xml:space="preserve">Kapitel für Sanitär, das neue Bad, Heizung, Boiler, Spenglerei, Referenzen, Über uns und </w:t>
+      </w:r>
+      <w:r>
+        <w:rPr>
+          <w:rFonts w:ascii="Arial" w:cs="Arial" w:eastAsia="Arial" w:hAnsi="Arial"/>
+          <w:b/>
+          <w:bCs/>
+          <w:color w:val="1D1D1F"/>
+          <w:sz w:val="20"/>
+          <w:szCs w:val="20"/>
+        </w:rPr>
+        <w:t xml:space="preserve">«Arbeiten bei uns»</w:t>
+      </w:r>
+      <w:r>
+        <w:rPr>
+          <w:rFonts w:ascii="Arial" w:cs="Arial" w:eastAsia="Arial" w:hAnsi="Arial"/>
+          <w:color w:val="1D1D1F"/>
+          <w:sz w:val="20"/>
+          <w:szCs w:val="20"/>
+        </w:rPr>
+        <w:t xml:space="preserve"> für Lehrstellen</w:t>
       </w:r>
     </w:p>
     <w:p>
@@ -450,7 +470,26 @@
           <w:sz w:val="20"/>
           <w:szCs w:val="20"/>
         </w:rPr>
-        <w:t xml:space="preserve">Optimiert für Handy, Tablet und Computer, gehostet in der Schweiz</w:t>
+        <w:t xml:space="preserve">Kontaktformular mit Themenwahl sowie Direktlinks für Anruf, Online-Termin und Route</w:t>
+      </w:r>
+    </w:p>
+    <w:p>
+      <w:pPr>
+        <w:pStyle w:val="ListParagraph"/>
+        <w:numPr>
+          <w:ilvl w:val="0"/>
+          <w:numId w:val="2"/>
+        </w:numPr>
+        <w:spacing w:after="60" w:line="276"/>
+      </w:pPr>
+      <w:r>
+        <w:rPr>
+          <w:rFonts w:ascii="Arial" w:cs="Arial" w:eastAsia="Arial" w:hAnsi="Arial"/>
+          <w:color w:val="1D1D1F"/>
+          <w:sz w:val="20"/>
+          <w:szCs w:val="20"/>
+        </w:rPr>
+        <w:t xml:space="preserve">Kurz und schnell: ruhige Bewegungen, optimiert für Handy, Tablet und Computer, gehostet in der Schweiz</w:t>
       </w:r>
     </w:p>
     <w:p>
@@ -476,6 +515,20 @@
           <w:highlightCs w:val="yellow"/>
         </w:rPr>
         <w:t xml:space="preserve">[Link zur Vorschau]</w:t>
+      </w:r>
+    </w:p>
+    <w:p>
+      <w:pPr>
+        <w:spacing w:after="120" w:line="288"/>
+      </w:pPr>
+      <w:r>
+        <w:rPr>
+          <w:rFonts w:ascii="Arial" w:cs="Arial" w:eastAsia="Arial" w:hAnsi="Arial"/>
+          <w:color w:val="62646B"/>
+          <w:sz w:val="18"/>
+          <w:szCs w:val="18"/>
+        </w:rPr>
+        <w:t xml:space="preserve">Im Entwurf sind Einsatzgebiet, Notfalldienst und Bürozeiten Beispielangaben und die Bilder teilweise Beispielbilder. Beides wird mit Ihren Angaben und Fotos ersetzt.</w:t>
       </w:r>
     </w:p>
     <w:p>
@@ -817,6 +870,137 @@
                 <w:sz w:val="20"/>
                 <w:szCs w:val="20"/>
               </w:rPr>
+              <w:t xml:space="preserve">Schnellinfos und Anrufleiste fürs Handy</w:t>
+            </w:r>
+          </w:p>
+        </w:tc>
+        <w:tc>
+          <w:tcPr>
+            <w:tcW w:type="dxa" w:w="2133"/>
+            <w:tcBorders>
+              <w:top w:val="none" w:color="FFFFFF" w:sz="0"/>
+              <w:left w:val="none" w:color="FFFFFF" w:sz="0"/>
+              <w:bottom w:val="single" w:color="D9DDE3" w:sz="4"/>
+              <w:right w:val="none" w:color="FFFFFF" w:sz="0"/>
+            </w:tcBorders>
+            <w:shd w:fill="E3EEFA" w:color="auto" w:val="clear"/>
+            <w:tcMar>
+              <w:top w:type="dxa" w:w="90"/>
+              <w:left w:type="dxa" w:w="110"/>
+              <w:bottom w:type="dxa" w:w="90"/>
+              <w:right w:type="dxa" w:w="110"/>
+            </w:tcMar>
+            <w:vAlign w:val="center"/>
+          </w:tcPr>
+          <w:p>
+            <w:pPr>
+              <w:jc w:val="center"/>
+            </w:pPr>
+            <w:r>
+              <w:rPr>
+                <w:rFonts w:ascii="Segoe UI Symbol" w:cs="Segoe UI Symbol" w:eastAsia="Segoe UI Symbol" w:hAnsi="Segoe UI Symbol"/>
+                <w:color w:val="1D1D1F"/>
+                <w:sz w:val="20"/>
+                <w:szCs w:val="20"/>
+              </w:rPr>
+              <w:t xml:space="preserve">✓</w:t>
+            </w:r>
+          </w:p>
+        </w:tc>
+        <w:tc>
+          <w:tcPr>
+            <w:tcW w:type="dxa" w:w="2133"/>
+            <w:tcBorders>
+              <w:top w:val="none" w:color="FFFFFF" w:sz="0"/>
+              <w:left w:val="none" w:color="FFFFFF" w:sz="0"/>
+              <w:bottom w:val="single" w:color="D9DDE3" w:sz="4"/>
+              <w:right w:val="none" w:color="FFFFFF" w:sz="0"/>
+            </w:tcBorders>
+            <w:tcMar>
+              <w:top w:type="dxa" w:w="90"/>
+              <w:left w:type="dxa" w:w="110"/>
+              <w:bottom w:type="dxa" w:w="90"/>
+              <w:right w:type="dxa" w:w="110"/>
+            </w:tcMar>
+            <w:vAlign w:val="center"/>
+          </w:tcPr>
+          <w:p>
+            <w:pPr>
+              <w:jc w:val="center"/>
+            </w:pPr>
+            <w:r>
+              <w:rPr>
+                <w:rFonts w:ascii="Segoe UI Symbol" w:cs="Segoe UI Symbol" w:eastAsia="Segoe UI Symbol" w:hAnsi="Segoe UI Symbol"/>
+                <w:color w:val="1D1D1F"/>
+                <w:sz w:val="20"/>
+                <w:szCs w:val="20"/>
+              </w:rPr>
+              <w:t xml:space="preserve">✓</w:t>
+            </w:r>
+          </w:p>
+        </w:tc>
+        <w:tc>
+          <w:tcPr>
+            <w:tcW w:type="dxa" w:w="2134"/>
+            <w:tcBorders>
+              <w:top w:val="none" w:color="FFFFFF" w:sz="0"/>
+              <w:left w:val="none" w:color="FFFFFF" w:sz="0"/>
+              <w:bottom w:val="single" w:color="D9DDE3" w:sz="4"/>
+              <w:right w:val="none" w:color="FFFFFF" w:sz="0"/>
+            </w:tcBorders>
+            <w:tcMar>
+              <w:top w:type="dxa" w:w="90"/>
+              <w:left w:type="dxa" w:w="110"/>
+              <w:bottom w:type="dxa" w:w="90"/>
+              <w:right w:type="dxa" w:w="110"/>
+            </w:tcMar>
+            <w:vAlign w:val="center"/>
+          </w:tcPr>
+          <w:p>
+            <w:pPr>
+              <w:jc w:val="center"/>
+            </w:pPr>
+            <w:r>
+              <w:rPr>
+                <w:rFonts w:ascii="Segoe UI Symbol" w:cs="Segoe UI Symbol" w:eastAsia="Segoe UI Symbol" w:hAnsi="Segoe UI Symbol"/>
+                <w:color w:val="1D1D1F"/>
+                <w:sz w:val="20"/>
+                <w:szCs w:val="20"/>
+              </w:rPr>
+              <w:t xml:space="preserve">✓</w:t>
+            </w:r>
+          </w:p>
+        </w:tc>
+      </w:tr>
+      <w:tr>
+        <w:trPr>
+          <w:cantSplit/>
+        </w:trPr>
+        <w:tc>
+          <w:tcPr>
+            <w:tcW w:type="dxa" w:w="3238"/>
+            <w:tcBorders>
+              <w:top w:val="none" w:color="FFFFFF" w:sz="0"/>
+              <w:left w:val="none" w:color="FFFFFF" w:sz="0"/>
+              <w:bottom w:val="single" w:color="D9DDE3" w:sz="4"/>
+              <w:right w:val="none" w:color="FFFFFF" w:sz="0"/>
+            </w:tcBorders>
+            <w:tcMar>
+              <w:top w:type="dxa" w:w="90"/>
+              <w:left w:type="dxa" w:w="110"/>
+              <w:bottom w:type="dxa" w:w="90"/>
+              <w:right w:type="dxa" w:w="110"/>
+            </w:tcMar>
+            <w:vAlign w:val="center"/>
+          </w:tcPr>
+          <w:p>
+            <w:r>
+              <w:rPr>
+                <w:rFonts w:ascii="Arial" w:cs="Arial" w:eastAsia="Arial" w:hAnsi="Arial"/>
+                <w:color w:val="1D1D1F"/>
+                <w:sz w:val="20"/>
+                <w:szCs w:val="20"/>
+              </w:rPr>
               <w:t xml:space="preserve">Rubrik «Arbeiten bei uns»</w:t>
             </w:r>
           </w:p>
@@ -2895,7 +3079,7 @@
           <w:sz w:val="20"/>
           <w:szCs w:val="20"/>
         </w:rPr>
-        <w:t xml:space="preserve">Die fertige Website im neuen Design mit allen Kapiteln. Ich übernehme Ihre bestehenden Texte und Bilder, korrigiere sie in Schweizer Rechtschreibung und ergänze die Rubrik «Arbeiten bei uns» mit Ihren Angaben. Nach einer Korrekturrunde schalte ich die Seite auf, inklusive Formular, Impressum, Datenschutzerklärung und Domain-Umzug.</w:t>
+        <w:t xml:space="preserve">Die fertige Website im neuen Design mit allen Kapiteln. Ich übernehme Ihre bestehenden Texte und Bilder, korrigiere sie in Schweizer Rechtschreibung und ergänze die Schnellinfos, «Über uns» und «Arbeiten bei uns» mit Ihren Angaben. Nach einer Korrekturrunde schalte ich die Seite auf, inklusive Formular, Impressum, Datenschutzerklärung und Domain-Umzug.</w:t>
       </w:r>
     </w:p>
     <w:p>
@@ -3130,7 +3314,7 @@
                 <w:sz w:val="18"/>
                 <w:szCs w:val="18"/>
               </w:rPr>
-              <w:t xml:space="preserve">Programmierung inkl. animierter Wasserleitung, Bildoptimierung, Tests auf gängigen Geräten.</w:t>
+              <w:t xml:space="preserve">Programmierung inkl. Anrufleiste fürs Handy, animierter Wasserleitung, Bildoptimierung und Tests auf gängigen Geräten.</w:t>
             </w:r>
           </w:p>
         </w:tc>
@@ -3914,7 +4098,7 @@
           <w:sz w:val="20"/>
           <w:szCs w:val="20"/>
         </w:rPr>
-        <w:t xml:space="preserve">Öffnungszeiten, E-Mail-Adresse und gegebenenfalls eine Notfallnummer</w:t>
+        <w:t xml:space="preserve">Einsatzgebiet (Gemeinden), Bürozeiten, E-Mail-Adresse und ob Sie einen Notfalldienst anbieten</w:t>
       </w:r>
     </w:p>
     <w:p>
@@ -4657,7 +4841,7 @@
           <w:sz w:val="20"/>
           <w:szCs w:val="20"/>
         </w:rPr>
-        <w:t xml:space="preserve">Diese Offerte ist gültig bis 17. Dezember 2026.</w:t>
+        <w:t xml:space="preserve">Diese Offerte ist gültig bis 24. Dezember 2026.</w:t>
       </w:r>
     </w:p>
     <w:p>
@@ -4735,7 +4919,7 @@
           <w:sz w:val="20"/>
           <w:szCs w:val="20"/>
         </w:rPr>
-        <w:t xml:space="preserve">Die Kurt Burri AG erteilt den Auftrag gemäss Offerte Nr. 2026-001 vom 18. Oktober 2026.</w:t>
+        <w:t xml:space="preserve">Die Kurt Burri AG erteilt den Auftrag gemäss Offerte Nr. 2026-001 vom 25. Oktober 2026.</w:t>
       </w:r>
     </w:p>
     <w:p>

</xml_diff>